<commit_message>
release: finalize EconoCausal v1.0.0 deliverables and audit trail
</commit_message>
<xml_diff>
--- a/05_Final_Deliverables/EconoCausal_Final_Project_Report.docx
+++ b/05_Final_Deliverables/EconoCausal_Final_Project_Report.docx
@@ -592,7 +592,7 @@
           <w:color w:val="334155"/>
           <w:sz w:val="21"/>
         </w:rPr>
-        <w:t>Across a 10,000-customer benchmark cohort, EconoCausal generates ₹3,76,115.07 in net incremental profit (7.52x ROAS), outperforming random promotional rollouts by +75.5% (+₹1,61,765.07) while leaving 5,432 organic buyers at full price. The causal model satisfies all 4 econometric refutation stress-tests (Placebo p=0.485, Confounder drift 0.16%, Subset drift 0.03%) and achieves post-matching covariate balance (|SMD| &lt; 0.022 across all 9 confounders). The complete solution is delivered via an asynchronous FastAPI microservice and an interactive React 19 executive dashboard.</w:t>
+        <w:t>Across a 10,000-customer benchmark cohort, EconoCausal generates ₹3,76,115.07 in net incremental profit (7.52x ROAS), outperforming random promotional rollouts by +75.5% (+₹1,61,765.07) while leaving 5,432 organic buyers at full price. The causal model satisfies all five reported causal falsification diagnostics (including Placebo p=0.485, Confounder drift 0.16%, Subset drift 0.03%, Positivity drift 0.17%, and the Model-Based Residual Permutation Diagnostic p=0.0020) and achieves post-matching covariate balance (|SMD| &lt; 0.022 across all 9 confounders). The complete solution is delivered via an asynchronous FastAPI microservice and an interactive React 19 executive dashboard.</w:t>
       </w:r>
     </w:p>
     <w:p>
@@ -3088,7 +3088,7 @@
                 <w:color w:val="1E293B"/>
                 <w:sz w:val="18"/>
               </w:rPr>
-              <w:t>Covariate Balance (PSM)</w:t>
+              <w:t>Residual Permutation Diagnostic</w:t>
             </w:r>
           </w:p>
         </w:tc>
@@ -3110,7 +3110,7 @@
                 <w:color w:val="1E293B"/>
                 <w:sz w:val="18"/>
               </w:rPr>
-              <w:t>1:1 Caliper Matching (95.9% matched)</w:t>
+              <w:t>Permutes DML residuals (500 draws)</w:t>
             </w:r>
           </w:p>
         </w:tc>
@@ -3132,6 +3132,97 @@
                 <w:color w:val="1E293B"/>
                 <w:sz w:val="18"/>
               </w:rPr>
+              <w:t>Observed uplift +14.22% vs null [-2.12%, +2.02%] (p = 0.002)</w:t>
+            </w:r>
+          </w:p>
+        </w:tc>
+        <w:tc>
+          <w:tcPr>
+            <w:tcW w:type="dxa" w:w="1008"/>
+            <w:shd w:val="clear" w:color="auto" w:fill="FFFFFF"/>
+            <w:tcMar>
+              <w:top w:w="80" w:type="dxa"/>
+              <w:bottom w:w="80" w:type="dxa"/>
+              <w:left w:w="140" w:type="dxa"/>
+              <w:right w:w="140" w:type="dxa"/>
+            </w:tcMar>
+          </w:tcPr>
+          <w:p>
+            <w:r>
+              <w:rPr>
+                <w:rFonts w:ascii="Calibri" w:hAnsi="Calibri"/>
+                <w:color w:val="1E293B"/>
+                <w:sz w:val="18"/>
+              </w:rPr>
+              <w:t>PASS</w:t>
+            </w:r>
+          </w:p>
+        </w:tc>
+      </w:tr>
+      <w:tr>
+        <w:tc>
+          <w:tcPr>
+            <w:tcW w:type="dxa" w:w="2592"/>
+            <w:shd w:val="clear" w:color="auto" w:fill="F8FAFC"/>
+            <w:tcMar>
+              <w:top w:w="80" w:type="dxa"/>
+              <w:bottom w:w="80" w:type="dxa"/>
+              <w:left w:w="140" w:type="dxa"/>
+              <w:right w:w="140" w:type="dxa"/>
+            </w:tcMar>
+          </w:tcPr>
+          <w:p>
+            <w:r>
+              <w:rPr>
+                <w:rFonts w:ascii="Calibri" w:hAnsi="Calibri"/>
+                <w:b/>
+                <w:color w:val="1E293B"/>
+                <w:sz w:val="18"/>
+              </w:rPr>
+              <w:t>Covariate Balance (PSM)</w:t>
+            </w:r>
+          </w:p>
+        </w:tc>
+        <w:tc>
+          <w:tcPr>
+            <w:tcW w:type="dxa" w:w="2592"/>
+            <w:shd w:val="clear" w:color="auto" w:fill="F8FAFC"/>
+            <w:tcMar>
+              <w:top w:w="80" w:type="dxa"/>
+              <w:bottom w:w="80" w:type="dxa"/>
+              <w:left w:w="140" w:type="dxa"/>
+              <w:right w:w="140" w:type="dxa"/>
+            </w:tcMar>
+          </w:tcPr>
+          <w:p>
+            <w:r>
+              <w:rPr>
+                <w:rFonts w:ascii="Calibri" w:hAnsi="Calibri"/>
+                <w:color w:val="1E293B"/>
+                <w:sz w:val="18"/>
+              </w:rPr>
+              <w:t>1:1 Caliper Matching (95.9% matched)</w:t>
+            </w:r>
+          </w:p>
+        </w:tc>
+        <w:tc>
+          <w:tcPr>
+            <w:tcW w:type="dxa" w:w="3168"/>
+            <w:shd w:val="clear" w:color="auto" w:fill="F8FAFC"/>
+            <w:tcMar>
+              <w:top w:w="80" w:type="dxa"/>
+              <w:bottom w:w="80" w:type="dxa"/>
+              <w:left w:w="140" w:type="dxa"/>
+              <w:right w:w="140" w:type="dxa"/>
+            </w:tcMar>
+          </w:tcPr>
+          <w:p>
+            <w:r>
+              <w:rPr>
+                <w:rFonts w:ascii="Calibri" w:hAnsi="Calibri"/>
+                <w:color w:val="1E293B"/>
+                <w:sz w:val="18"/>
+              </w:rPr>
               <w:t>|SMD| &lt; 0.022 across all 9 confounders</w:t>
             </w:r>
           </w:p>
@@ -3139,7 +3230,7 @@
         <w:tc>
           <w:tcPr>
             <w:tcW w:type="dxa" w:w="1008"/>
-            <w:shd w:val="clear" w:color="auto" w:fill="FFFFFF"/>
+            <w:shd w:val="clear" w:color="auto" w:fill="F8FAFC"/>
             <w:tcMar>
               <w:top w:w="80" w:type="dxa"/>
               <w:bottom w:w="80" w:type="dxa"/>
@@ -4105,7 +4196,7 @@
           <w:color w:val="334155"/>
           <w:sz w:val="21"/>
         </w:rPr>
-        <w:t>All 39 automated tests across the repository pass with zero errors:</w:t>
+        <w:t>The repository defines 66 distinct automated unit test cases, of which 64 are safe runnable regression tests (with 2 tests permanently quarantined against benchmark data leakage):</w:t>
       </w:r>
     </w:p>
     <w:p>
@@ -4119,7 +4210,7 @@
           <w:color w:val="334155"/>
           <w:sz w:val="20"/>
         </w:rPr>
-        <w:t>python -m unittest discover -s 02_Causal_ML -p 'test_*.py'  --&gt;  4/4 Passed (100%)</w:t>
+        <w:t>python -m unittest 02_Causal_ML.test_dml.TestDoubleMachineLearning.test_01_missing_file_handling 02_Causal_ML.test_dml.TestDoubleMachineLearning.test_02_anti_leakage_safeguard 02_Causal_ML.test_dml.TestDoubleMachineLearning.test_05_production_artifacts_unmodified  --&gt;  3 Safe Tests (test_05 passed live; test_01, test_02 WDAC-constrained; test_03, test_04 quarantined)</w:t>
       </w:r>
     </w:p>
     <w:p>
@@ -4133,7 +4224,7 @@
           <w:color w:val="334155"/>
           <w:sz w:val="20"/>
         </w:rPr>
-        <w:t>python 03_Backend_Optimization/test_optimizer.py  --&gt;  12/12 Passed (100%)</w:t>
+        <w:t>python -m unittest 03_Backend_Optimization/test_optimizer.py  --&gt;  13/13 LIVE PASS (23.8s)</w:t>
       </w:r>
     </w:p>
     <w:p>
@@ -4147,7 +4238,7 @@
           <w:color w:val="334155"/>
           <w:sz w:val="20"/>
         </w:rPr>
-        <w:t>python 03_Backend_Optimization/test_validation.py  --&gt;  5/5 Passed (100%)</w:t>
+        <w:t>python -B -m unittest 03_Backend_Optimization/test_validation.py  --&gt;  14 Tests (Historical Pass; Host WDAC Constrained in L8)</w:t>
       </w:r>
     </w:p>
     <w:p>
@@ -4161,7 +4252,7 @@
           <w:color w:val="334155"/>
           <w:sz w:val="20"/>
         </w:rPr>
-        <w:t>python -m unittest 04_Frontend_Dashboard/backend/test_api.py  --&gt;  17/17 Passed (100%)</w:t>
+        <w:t>python -m unittest 04_Frontend_Dashboard/backend/test_api.py  --&gt;  34 Tests (33 LIVE PASS; test_19 WDAC-constrained)</w:t>
       </w:r>
     </w:p>
     <w:p>
@@ -4175,7 +4266,21 @@
           <w:color w:val="334155"/>
           <w:sz w:val="20"/>
         </w:rPr>
-        <w:t>cd 04_Frontend_Dashboard &amp;&amp; npm run build  --&gt;  Vite Production Build Passed (543ms)</w:t>
+        <w:t>python 01_Dataset_Analysis/inspect_dataset.py --path 01_Dataset_Analysis/cleaned_pricing_data.csv  --&gt;  LIVE PASS (10,000 rows, 16 cols)</w:t>
+      </w:r>
+    </w:p>
+    <w:p>
+      <w:pPr>
+        <w:pStyle w:val="ListBullet"/>
+        <w:spacing w:after="80" w:line="276" w:lineRule="auto"/>
+      </w:pPr>
+      <w:r>
+        <w:rPr>
+          <w:rFonts w:ascii="Calibri" w:hAnsi="Calibri"/>
+          <w:color w:val="334155"/>
+          <w:sz w:val="20"/>
+        </w:rPr>
+        <w:t>cd 04_Frontend_Dashboard &amp;&amp; npm run build  --&gt;  Vite Production Build LIVE PASS (2.22s, 0 errors)</w:t>
       </w:r>
     </w:p>
     <w:sectPr>

</xml_diff>